<commit_message>
Escopo do projeto Patinhas Felizes Atualizado
</commit_message>
<xml_diff>
--- a/DOC/Escopo Patinhas Felizes.docx
+++ b/DOC/Escopo Patinhas Felizes.docx
@@ -1749,251 +1749,298 @@
         <w:pStyle w:val="ListParagraph"/>
         <w:widowControl w:val="0"/>
         <w:pBdr>
+          <w:top w:val="nil" w:color="FF000000" w:sz="0" w:space="0"/>
+          <w:left w:val="nil" w:color="FF000000" w:sz="0" w:space="0"/>
+          <w:bottom w:val="nil" w:color="FF000000" w:sz="0" w:space="0"/>
+          <w:right w:val="nil" w:color="FF000000" w:sz="0" w:space="0"/>
+          <w:between w:val="nil" w:color="FF000000" w:sz="0" w:space="0"/>
+        </w:pBdr>
+        <w:spacing w:line="360" w:lineRule="auto"/>
+        <w:ind w:firstLine="283"/>
+        <w:jc w:val="both"/>
+      </w:pPr>
+      <w:r>
+        <w:rPr>
+          <w:color w:val="000000" w:themeColor="text1" w:themeTint="FF" w:themeShade="FF"/>
+          <w:sz w:val="24"/>
+          <w:szCs w:val="24"/>
+        </w:rPr>
+        <w:t>Muitos tutores têm tido muitas dificuldades com atendimento de emergência</w:t>
+      </w:r>
+      <w:r>
+        <w:rPr>
+          <w:color w:val="000000" w:themeColor="text1" w:themeTint="FF" w:themeShade="FF"/>
+          <w:sz w:val="24"/>
+          <w:szCs w:val="24"/>
+        </w:rPr>
+        <w:t xml:space="preserve"> no meio da madrugada</w:t>
+      </w:r>
+      <w:r>
+        <w:rPr>
+          <w:color w:val="000000" w:themeColor="text1" w:themeTint="FF" w:themeShade="FF"/>
+          <w:sz w:val="24"/>
+          <w:szCs w:val="24"/>
+        </w:rPr>
+        <w:t>, ou até mesmo</w:t>
+      </w:r>
+      <w:r>
+        <w:rPr>
+          <w:color w:val="000000" w:themeColor="text1" w:themeTint="FF" w:themeShade="FF"/>
+          <w:sz w:val="24"/>
+          <w:szCs w:val="24"/>
+        </w:rPr>
+        <w:t xml:space="preserve"> </w:t>
+      </w:r>
+      <w:r>
+        <w:rPr>
+          <w:color w:val="000000" w:themeColor="text1" w:themeTint="FF" w:themeShade="FF"/>
+          <w:sz w:val="24"/>
+          <w:szCs w:val="24"/>
+        </w:rPr>
+        <w:t>na compra de algum acessório ou remédio para seu pet</w:t>
+      </w:r>
+      <w:r>
+        <w:rPr>
+          <w:color w:val="000000" w:themeColor="text1" w:themeTint="FF" w:themeShade="FF"/>
+          <w:sz w:val="24"/>
+          <w:szCs w:val="24"/>
+        </w:rPr>
+        <w:t>.</w:t>
+      </w:r>
+      <w:r>
+        <w:rPr>
+          <w:color w:val="000000" w:themeColor="text1" w:themeTint="FF" w:themeShade="FF"/>
+          <w:sz w:val="24"/>
+          <w:szCs w:val="24"/>
+        </w:rPr>
+        <w:t xml:space="preserve"> </w:t>
+      </w:r>
+      <w:r>
+        <w:rPr>
+          <w:color w:val="000000" w:themeColor="text1" w:themeTint="FF" w:themeShade="FF"/>
+          <w:sz w:val="24"/>
+          <w:szCs w:val="24"/>
+        </w:rPr>
+        <w:t xml:space="preserve">Com isso, </w:t>
+      </w:r>
+      <w:r>
+        <w:rPr>
+          <w:color w:val="000000" w:themeColor="text1" w:themeTint="FF" w:themeShade="FF"/>
+          <w:sz w:val="24"/>
+          <w:szCs w:val="24"/>
+        </w:rPr>
+        <w:t>a ideia é desenvolver uma página web</w:t>
+      </w:r>
+      <w:r>
+        <w:rPr>
+          <w:color w:val="000000" w:themeColor="text1" w:themeTint="FF" w:themeShade="FF"/>
+          <w:sz w:val="24"/>
+          <w:szCs w:val="24"/>
+        </w:rPr>
+        <w:t xml:space="preserve">, para que possamos ajudar todos os usuários que precisam de um atendimento de </w:t>
+      </w:r>
+      <w:r>
+        <w:rPr>
+          <w:color w:val="000000" w:themeColor="text1" w:themeTint="FF" w:themeShade="FF"/>
+          <w:sz w:val="24"/>
+          <w:szCs w:val="24"/>
+        </w:rPr>
+        <w:t>emergência através de um</w:t>
+      </w:r>
+      <w:r>
+        <w:rPr>
+          <w:sz w:val="24"/>
+          <w:szCs w:val="24"/>
+        </w:rPr>
+        <w:t xml:space="preserve"> chat virtual,</w:t>
+      </w:r>
+      <w:r>
+        <w:rPr>
+          <w:color w:val="000000" w:themeColor="text1" w:themeTint="FF" w:themeShade="FF"/>
+          <w:sz w:val="24"/>
+          <w:szCs w:val="24"/>
+        </w:rPr>
+        <w:t xml:space="preserve"> </w:t>
+      </w:r>
+      <w:r>
+        <w:rPr>
+          <w:color w:val="000000" w:themeColor="text1" w:themeTint="FF" w:themeShade="FF"/>
+          <w:sz w:val="24"/>
+          <w:szCs w:val="24"/>
+        </w:rPr>
+        <w:t xml:space="preserve">e de medicamentos e artigos </w:t>
+      </w:r>
+      <w:r>
+        <w:rPr>
+          <w:color w:val="000000" w:themeColor="text1" w:themeTint="FF" w:themeShade="FF"/>
+          <w:sz w:val="24"/>
+          <w:szCs w:val="24"/>
+        </w:rPr>
+        <w:t>pet’s</w:t>
+      </w:r>
+      <w:r>
+        <w:rPr>
+          <w:color w:val="000000" w:themeColor="text1" w:themeTint="FF" w:themeShade="FF"/>
+          <w:sz w:val="24"/>
+          <w:szCs w:val="24"/>
+        </w:rPr>
+        <w:t xml:space="preserve"> </w:t>
+      </w:r>
+      <w:r>
+        <w:rPr>
+          <w:sz w:val="24"/>
+          <w:szCs w:val="24"/>
+        </w:rPr>
+        <w:t>através</w:t>
+      </w:r>
+      <w:r>
+        <w:rPr>
+          <w:sz w:val="24"/>
+          <w:szCs w:val="24"/>
+        </w:rPr>
+        <w:t xml:space="preserve"> de uma compra online </w:t>
+      </w:r>
+      <w:r>
+        <w:rPr>
+          <w:sz w:val="24"/>
+          <w:szCs w:val="24"/>
+        </w:rPr>
+        <w:t>(para compras de</w:t>
+      </w:r>
+      <w:r>
+        <w:rPr>
+          <w:color w:val="FF0000"/>
+          <w:sz w:val="24"/>
+          <w:szCs w:val="24"/>
+        </w:rPr>
+        <w:t xml:space="preserve"> </w:t>
+      </w:r>
+      <w:r>
+        <w:rPr>
+          <w:sz w:val="24"/>
+          <w:szCs w:val="24"/>
+        </w:rPr>
+        <w:t>antimicrobianos</w:t>
+      </w:r>
+      <w:r>
+        <w:rPr/>
+        <w:t>,</w:t>
+      </w:r>
+      <w:r>
+        <w:rPr/>
+        <w:t xml:space="preserve"> </w:t>
+      </w:r>
+      <w:r>
+        <w:rPr>
+          <w:sz w:val="24"/>
+          <w:szCs w:val="24"/>
+        </w:rPr>
+        <w:t>produtos de controle especial</w:t>
+      </w:r>
+      <w:r>
+        <w:rPr>
+          <w:sz w:val="24"/>
+          <w:szCs w:val="24"/>
+        </w:rPr>
+        <w:t xml:space="preserve">, </w:t>
+      </w:r>
+      <w:r>
+        <w:rPr>
+          <w:sz w:val="24"/>
+          <w:szCs w:val="24"/>
+        </w:rPr>
+        <w:t>só</w:t>
+      </w:r>
+      <w:r>
+        <w:rPr>
+          <w:sz w:val="24"/>
+          <w:szCs w:val="24"/>
+        </w:rPr>
+        <w:t xml:space="preserve"> </w:t>
+      </w:r>
+      <w:r>
+        <w:rPr>
+          <w:sz w:val="24"/>
+          <w:szCs w:val="24"/>
+        </w:rPr>
+        <w:t xml:space="preserve">serão aceitas </w:t>
+      </w:r>
+      <w:r>
+        <w:rPr>
+          <w:sz w:val="24"/>
+          <w:szCs w:val="24"/>
+        </w:rPr>
+        <w:t xml:space="preserve">com </w:t>
+      </w:r>
+      <w:r>
+        <w:rPr>
+          <w:sz w:val="24"/>
+          <w:szCs w:val="24"/>
+        </w:rPr>
+        <w:t xml:space="preserve">prescrição </w:t>
+      </w:r>
+      <w:r>
+        <w:rPr>
+          <w:sz w:val="24"/>
+          <w:szCs w:val="24"/>
+        </w:rPr>
+        <w:t>veterinária</w:t>
+      </w:r>
+      <w:r>
+        <w:rPr/>
+        <w:t>)</w:t>
+      </w:r>
+      <w:r>
+        <w:rPr/>
+        <w:t>.</w:t>
+      </w:r>
+    </w:p>
+    <w:p>
+      <w:pPr>
+        <w:pStyle w:val="ListParagraph"/>
+        <w:widowControl w:val="0"/>
+        <w:pBdr>
+          <w:top w:val="nil" w:color="FF000000" w:sz="0" w:space="0"/>
+          <w:left w:val="nil" w:color="FF000000" w:sz="0" w:space="0"/>
+          <w:bottom w:val="nil" w:color="FF000000" w:sz="0" w:space="0"/>
+          <w:right w:val="nil" w:color="FF000000" w:sz="0" w:space="0"/>
+          <w:between w:val="nil" w:color="FF000000" w:sz="0" w:space="0"/>
+        </w:pBdr>
+        <w:jc w:val="both"/>
+        <w:rPr>
+          <w:color w:val="000000" w:themeColor="text1"/>
+          <w:sz w:val="24"/>
+          <w:szCs w:val="24"/>
+        </w:rPr>
+      </w:pPr>
+    </w:p>
+    <w:p>
+      <w:pPr>
+        <w:pStyle w:val="ListParagraph"/>
+        <w:widowControl w:val="0"/>
+        <w:pBdr>
           <w:top w:val="nil"/>
           <w:left w:val="nil"/>
           <w:bottom w:val="nil"/>
           <w:right w:val="nil"/>
           <w:between w:val="nil"/>
         </w:pBdr>
-      </w:pPr>
-      <w:r>
-        <w:rPr>
+        <w:rPr>
+          <w:b/>
           <w:color w:val="000000" w:themeColor="text1"/>
           <w:sz w:val="24"/>
           <w:szCs w:val="24"/>
         </w:rPr>
-        <w:t>Muitos tutores têm tido muitas dificuldades com atendimento de emergência</w:t>
-      </w:r>
-      <w:r>
-        <w:rPr>
-          <w:color w:val="000000" w:themeColor="text1"/>
-          <w:sz w:val="24"/>
-          <w:szCs w:val="24"/>
-        </w:rPr>
-        <w:t xml:space="preserve"> no meio da madrugada</w:t>
-      </w:r>
-      <w:r>
-        <w:rPr>
-          <w:color w:val="000000" w:themeColor="text1"/>
-          <w:sz w:val="24"/>
-          <w:szCs w:val="24"/>
-        </w:rPr>
-        <w:t>, ou até mesmo</w:t>
-      </w:r>
-      <w:r>
-        <w:rPr>
-          <w:color w:val="000000" w:themeColor="text1"/>
-          <w:sz w:val="24"/>
-          <w:szCs w:val="24"/>
-        </w:rPr>
-        <w:t xml:space="preserve"> </w:t>
-      </w:r>
-      <w:r>
-        <w:rPr>
-          <w:color w:val="000000" w:themeColor="text1"/>
-          <w:sz w:val="24"/>
-          <w:szCs w:val="24"/>
-        </w:rPr>
-        <w:t>na compra de algum acessório ou remédio para seu pet</w:t>
-      </w:r>
-      <w:r>
-        <w:rPr>
-          <w:color w:val="000000" w:themeColor="text1"/>
-          <w:sz w:val="24"/>
-          <w:szCs w:val="24"/>
-        </w:rPr>
-        <w:t>.</w:t>
-      </w:r>
-      <w:r>
-        <w:rPr>
-          <w:color w:val="000000" w:themeColor="text1"/>
-          <w:sz w:val="24"/>
-          <w:szCs w:val="24"/>
-        </w:rPr>
-        <w:t xml:space="preserve"> </w:t>
-      </w:r>
-      <w:r>
-        <w:rPr>
-          <w:color w:val="000000" w:themeColor="text1"/>
-          <w:sz w:val="24"/>
-          <w:szCs w:val="24"/>
-        </w:rPr>
-        <w:t xml:space="preserve">Com isso, </w:t>
-      </w:r>
-      <w:r>
-        <w:rPr>
-          <w:color w:val="000000" w:themeColor="text1"/>
-          <w:sz w:val="24"/>
-          <w:szCs w:val="24"/>
-        </w:rPr>
-        <w:t>a ideia é desenvolver uma página web</w:t>
-      </w:r>
-      <w:r>
-        <w:rPr>
-          <w:color w:val="000000" w:themeColor="text1"/>
-          <w:sz w:val="24"/>
-          <w:szCs w:val="24"/>
-        </w:rPr>
-        <w:t xml:space="preserve">, para que possamos ajudar todos os usuários que precisam de um atendimento de </w:t>
-      </w:r>
-      <w:r>
-        <w:rPr>
-          <w:color w:val="000000" w:themeColor="text1"/>
-          <w:sz w:val="24"/>
-          <w:szCs w:val="24"/>
-        </w:rPr>
-        <w:t>emergência através de um</w:t>
-      </w:r>
-      <w:r>
-        <w:rPr>
-          <w:sz w:val="24"/>
-          <w:szCs w:val="24"/>
-        </w:rPr>
-        <w:t xml:space="preserve"> chat virtual,</w:t>
-      </w:r>
-      <w:r>
-        <w:rPr>
-          <w:color w:val="000000" w:themeColor="text1"/>
-          <w:sz w:val="24"/>
-          <w:szCs w:val="24"/>
-        </w:rPr>
-        <w:t xml:space="preserve"> </w:t>
-      </w:r>
-      <w:r>
-        <w:rPr>
-          <w:color w:val="000000" w:themeColor="text1"/>
-          <w:sz w:val="24"/>
-          <w:szCs w:val="24"/>
-        </w:rPr>
-        <w:t xml:space="preserve">e de medicamentos e artigos </w:t>
-      </w:r>
-      <w:proofErr w:type="spellStart"/>
-      <w:r>
-        <w:rPr>
-          <w:color w:val="000000" w:themeColor="text1"/>
-          <w:sz w:val="24"/>
-          <w:szCs w:val="24"/>
-        </w:rPr>
-        <w:t>pet’s</w:t>
-      </w:r>
-      <w:proofErr w:type="spellEnd"/>
-      <w:r>
-        <w:rPr>
-          <w:color w:val="000000" w:themeColor="text1"/>
-          <w:sz w:val="24"/>
-          <w:szCs w:val="24"/>
-        </w:rPr>
-        <w:t xml:space="preserve"> </w:t>
-      </w:r>
-      <w:r>
-        <w:rPr>
-          <w:sz w:val="24"/>
-          <w:szCs w:val="24"/>
-        </w:rPr>
-        <w:t>através</w:t>
-      </w:r>
-      <w:r>
-        <w:rPr>
-          <w:sz w:val="24"/>
-          <w:szCs w:val="24"/>
-        </w:rPr>
-        <w:t xml:space="preserve"> de uma compra online </w:t>
-      </w:r>
-      <w:r>
-        <w:rPr>
-          <w:sz w:val="24"/>
-          <w:szCs w:val="24"/>
-        </w:rPr>
-        <w:t>(para compras de</w:t>
-      </w:r>
-      <w:r>
-        <w:rPr>
-          <w:color w:val="FF0000"/>
-          <w:sz w:val="24"/>
-          <w:szCs w:val="24"/>
-        </w:rPr>
-        <w:t xml:space="preserve"> </w:t>
-      </w:r>
-      <w:r>
-        <w:rPr>
-          <w:sz w:val="24"/>
-          <w:szCs w:val="24"/>
-        </w:rPr>
-        <w:t>antimicrobianos</w:t>
-      </w:r>
-      <w:r>
-        <w:t>,</w:t>
-      </w:r>
-      <w:r>
-        <w:t xml:space="preserve"> </w:t>
-      </w:r>
-      <w:r>
-        <w:rPr>
-          <w:sz w:val="24"/>
-          <w:szCs w:val="24"/>
-        </w:rPr>
-        <w:t>produtos de controle especial</w:t>
-      </w:r>
-      <w:r>
-        <w:rPr>
-          <w:sz w:val="24"/>
-          <w:szCs w:val="24"/>
-        </w:rPr>
-        <w:t xml:space="preserve">, </w:t>
-      </w:r>
-      <w:r>
-        <w:rPr>
-          <w:sz w:val="24"/>
-          <w:szCs w:val="24"/>
-        </w:rPr>
-        <w:t>só</w:t>
-      </w:r>
-      <w:r>
-        <w:rPr>
-          <w:sz w:val="24"/>
-          <w:szCs w:val="24"/>
-        </w:rPr>
-        <w:t xml:space="preserve"> </w:t>
-      </w:r>
-      <w:r>
-        <w:rPr>
-          <w:sz w:val="24"/>
-          <w:szCs w:val="24"/>
-        </w:rPr>
-        <w:t xml:space="preserve">serão aceitas </w:t>
-      </w:r>
-      <w:r>
-        <w:rPr>
-          <w:sz w:val="24"/>
-          <w:szCs w:val="24"/>
-        </w:rPr>
-        <w:t xml:space="preserve">com </w:t>
-      </w:r>
-      <w:r>
-        <w:rPr>
-          <w:sz w:val="24"/>
-          <w:szCs w:val="24"/>
-        </w:rPr>
-        <w:t xml:space="preserve">prescrição </w:t>
-      </w:r>
-      <w:r>
-        <w:rPr>
-          <w:sz w:val="24"/>
-          <w:szCs w:val="24"/>
-        </w:rPr>
-        <w:t>veterinária</w:t>
-      </w:r>
-      <w:r>
-        <w:t>)</w:t>
-      </w:r>
-      <w:r>
-        <w:t>.</w:t>
-      </w:r>
+      </w:pPr>
     </w:p>
     <w:p>
       <w:pPr>
         <w:pStyle w:val="ListParagraph"/>
         <w:widowControl w:val="0"/>
+        <w:numPr>
+          <w:ilvl w:val="0"/>
+          <w:numId w:val="1"/>
+        </w:numPr>
         <w:pBdr>
           <w:top w:val="nil"/>
           <w:left w:val="nil"/>
@@ -2002,66 +2049,29 @@
           <w:between w:val="nil"/>
         </w:pBdr>
         <w:rPr>
-          <w:color w:val="000000" w:themeColor="text1"/>
-          <w:sz w:val="24"/>
-          <w:szCs w:val="24"/>
-        </w:rPr>
-      </w:pPr>
-    </w:p>
-    <w:p>
-      <w:pPr>
-        <w:pStyle w:val="ListParagraph"/>
-        <w:widowControl w:val="0"/>
-        <w:pBdr>
-          <w:top w:val="nil"/>
-          <w:left w:val="nil"/>
-          <w:bottom w:val="nil"/>
-          <w:right w:val="nil"/>
-          <w:between w:val="nil"/>
-        </w:pBdr>
+          <w:b/>
+          <w:color w:val="000000"/>
+          <w:sz w:val="24"/>
+          <w:szCs w:val="24"/>
+        </w:rPr>
+      </w:pPr>
+      <w:r>
         <w:rPr>
           <w:b/>
           <w:color w:val="000000" w:themeColor="text1"/>
           <w:sz w:val="24"/>
           <w:szCs w:val="24"/>
         </w:rPr>
-      </w:pPr>
+        <w:t>Descrição do projeto</w:t>
+      </w:r>
     </w:p>
     <w:p>
       <w:pPr>
         <w:pStyle w:val="ListParagraph"/>
         <w:widowControl w:val="0"/>
-        <w:numPr>
-          <w:ilvl w:val="0"/>
-          <w:numId w:val="1"/>
-        </w:numPr>
-        <w:pBdr>
-          <w:top w:val="nil"/>
-          <w:left w:val="nil"/>
-          <w:bottom w:val="nil"/>
-          <w:right w:val="nil"/>
-          <w:between w:val="nil"/>
-        </w:pBdr>
-        <w:rPr>
-          <w:b/>
-          <w:color w:val="000000"/>
-          <w:sz w:val="24"/>
-          <w:szCs w:val="24"/>
-        </w:rPr>
-      </w:pPr>
-      <w:r>
-        <w:rPr>
-          <w:b/>
-          <w:color w:val="000000" w:themeColor="text1"/>
-          <w:sz w:val="24"/>
-          <w:szCs w:val="24"/>
-        </w:rPr>
-        <w:t>Descrição do projeto</w:t>
-      </w:r>
-    </w:p>
-    <w:p>
-      <w:pPr>
-        <w:pStyle w:val="ListParagraph"/>
+        <w:spacing w:line="360" w:lineRule="auto"/>
+        <w:ind w:left="720" w:firstLine="283"/>
+        <w:jc w:val="both"/>
       </w:pPr>
       <w:r>
         <w:rPr>
@@ -2204,15 +2214,18 @@
       <w:pPr>
         <w:widowControl w:val="0"/>
         <w:pBdr>
-          <w:top w:val="nil"/>
-          <w:left w:val="nil"/>
-          <w:bottom w:val="nil"/>
-          <w:right w:val="nil"/>
-          <w:between w:val="nil"/>
-        </w:pBdr>
-        <w:rPr>
-          <w:b/>
-          <w:bCs/>
+          <w:top w:val="nil" w:color="FF000000" w:sz="0" w:space="0"/>
+          <w:left w:val="nil" w:color="FF000000" w:sz="0" w:space="0"/>
+          <w:bottom w:val="nil" w:color="FF000000" w:sz="0" w:space="0"/>
+          <w:right w:val="nil" w:color="FF000000" w:sz="0" w:space="0"/>
+          <w:between w:val="nil" w:color="FF000000" w:sz="0" w:space="0"/>
+        </w:pBdr>
+        <w:spacing w:line="360" w:lineRule="auto"/>
+        <w:ind w:left="720" w:firstLine="283"/>
+        <w:jc w:val="both"/>
+        <w:rPr>
+          <w:b w:val="1"/>
+          <w:bCs w:val="1"/>
           <w:color w:val="000000" w:themeColor="text1"/>
           <w:sz w:val="24"/>
           <w:szCs w:val="24"/>
@@ -2568,7 +2581,10 @@
     <w:p>
       <w:pPr>
         <w:widowControl w:val="0"/>
-        <w:spacing w:before="180" w:after="240"/>
+        <w:spacing w:before="0" w:beforeAutospacing="off" w:after="0" w:afterAutospacing="off" w:line="360" w:lineRule="auto"/>
+        <w:ind w:left="720" w:firstLine="283"/>
+        <w:contextualSpacing w:val="1"/>
+        <w:jc w:val="both"/>
       </w:pPr>
       <w:r>
         <w:rPr>
@@ -2885,6 +2901,179 @@
       <w:pPr>
         <w:widowControl w:val="0"/>
         <w:pBdr>
+          <w:top w:val="nil" w:color="FF000000" w:sz="0" w:space="0"/>
+          <w:left w:val="nil" w:color="FF000000" w:sz="0" w:space="0"/>
+          <w:bottom w:val="nil" w:color="FF000000" w:sz="0" w:space="0"/>
+          <w:right w:val="nil" w:color="FF000000" w:sz="0" w:space="0"/>
+          <w:between w:val="nil" w:color="FF000000" w:sz="0" w:space="0"/>
+        </w:pBdr>
+        <w:spacing w:line="360" w:lineRule="auto"/>
+        <w:ind w:left="720" w:firstLine="283"/>
+        <w:contextualSpacing w:val="1"/>
+        <w:jc w:val="both"/>
+        <w:rPr>
+          <w:color w:val="000000" w:themeColor="text1"/>
+          <w:sz w:val="24"/>
+          <w:szCs w:val="24"/>
+        </w:rPr>
+      </w:pPr>
+      <w:r>
+        <w:rPr>
+          <w:color w:val="000000" w:themeColor="text1" w:themeTint="FF" w:themeShade="FF"/>
+          <w:sz w:val="24"/>
+          <w:szCs w:val="24"/>
+        </w:rPr>
+        <w:t>O objetivo do</w:t>
+      </w:r>
+      <w:r>
+        <w:rPr>
+          <w:color w:val="000000" w:themeColor="text1" w:themeTint="FF" w:themeShade="FF"/>
+          <w:sz w:val="24"/>
+          <w:szCs w:val="24"/>
+        </w:rPr>
+        <w:t xml:space="preserve"> website </w:t>
+      </w:r>
+      <w:r>
+        <w:rPr>
+          <w:color w:val="000000" w:themeColor="text1" w:themeTint="FF" w:themeShade="FF"/>
+          <w:sz w:val="24"/>
+          <w:szCs w:val="24"/>
+        </w:rPr>
+        <w:t xml:space="preserve">é </w:t>
+      </w:r>
+      <w:r>
+        <w:rPr>
+          <w:color w:val="000000" w:themeColor="text1" w:themeTint="FF" w:themeShade="FF"/>
+          <w:sz w:val="24"/>
+          <w:szCs w:val="24"/>
+        </w:rPr>
+        <w:t>divulgar os</w:t>
+      </w:r>
+      <w:r>
+        <w:rPr>
+          <w:color w:val="000000" w:themeColor="text1" w:themeTint="FF" w:themeShade="FF"/>
+          <w:sz w:val="24"/>
+          <w:szCs w:val="24"/>
+        </w:rPr>
+        <w:t xml:space="preserve"> serviço</w:t>
+      </w:r>
+      <w:r>
+        <w:rPr>
+          <w:color w:val="000000" w:themeColor="text1" w:themeTint="FF" w:themeShade="FF"/>
+          <w:sz w:val="24"/>
+          <w:szCs w:val="24"/>
+        </w:rPr>
+        <w:t>s</w:t>
+      </w:r>
+      <w:r>
+        <w:rPr>
+          <w:color w:val="000000" w:themeColor="text1" w:themeTint="FF" w:themeShade="FF"/>
+          <w:sz w:val="24"/>
+          <w:szCs w:val="24"/>
+        </w:rPr>
+        <w:t>,</w:t>
+      </w:r>
+      <w:r>
+        <w:rPr>
+          <w:color w:val="000000" w:themeColor="text1" w:themeTint="FF" w:themeShade="FF"/>
+          <w:sz w:val="24"/>
+          <w:szCs w:val="24"/>
+        </w:rPr>
+        <w:t xml:space="preserve"> produtos </w:t>
+      </w:r>
+      <w:r>
+        <w:rPr>
+          <w:color w:val="000000" w:themeColor="text1" w:themeTint="FF" w:themeShade="FF"/>
+          <w:sz w:val="24"/>
+          <w:szCs w:val="24"/>
+        </w:rPr>
+        <w:t>e</w:t>
+      </w:r>
+      <w:r>
+        <w:rPr>
+          <w:color w:val="000000" w:themeColor="text1" w:themeTint="FF" w:themeShade="FF"/>
+          <w:sz w:val="24"/>
+          <w:szCs w:val="24"/>
+        </w:rPr>
+        <w:t xml:space="preserve"> atendimento</w:t>
+      </w:r>
+      <w:r>
+        <w:rPr>
+          <w:color w:val="000000" w:themeColor="text1" w:themeTint="FF" w:themeShade="FF"/>
+          <w:sz w:val="24"/>
+          <w:szCs w:val="24"/>
+        </w:rPr>
+        <w:t>s</w:t>
+      </w:r>
+      <w:r>
+        <w:rPr>
+          <w:color w:val="000000" w:themeColor="text1" w:themeTint="FF" w:themeShade="FF"/>
+          <w:sz w:val="24"/>
+          <w:szCs w:val="24"/>
+        </w:rPr>
+        <w:t xml:space="preserve"> d</w:t>
+      </w:r>
+      <w:r>
+        <w:rPr>
+          <w:color w:val="000000" w:themeColor="text1" w:themeTint="FF" w:themeShade="FF"/>
+          <w:sz w:val="24"/>
+          <w:szCs w:val="24"/>
+        </w:rPr>
+        <w:t>a empresa Patinhas Felizes</w:t>
+      </w:r>
+      <w:r>
+        <w:rPr>
+          <w:color w:val="000000" w:themeColor="text1" w:themeTint="FF" w:themeShade="FF"/>
+          <w:sz w:val="24"/>
+          <w:szCs w:val="24"/>
+        </w:rPr>
+        <w:t>, para que o</w:t>
+      </w:r>
+      <w:r>
+        <w:rPr>
+          <w:color w:val="000000" w:themeColor="text1" w:themeTint="FF" w:themeShade="FF"/>
+          <w:sz w:val="24"/>
+          <w:szCs w:val="24"/>
+        </w:rPr>
+        <w:t xml:space="preserve"> </w:t>
+      </w:r>
+      <w:r>
+        <w:rPr>
+          <w:color w:val="000000" w:themeColor="text1" w:themeTint="FF" w:themeShade="FF"/>
+          <w:sz w:val="24"/>
+          <w:szCs w:val="24"/>
+        </w:rPr>
+        <w:t xml:space="preserve">cliente </w:t>
+      </w:r>
+      <w:r>
+        <w:rPr>
+          <w:color w:val="000000" w:themeColor="text1" w:themeTint="FF" w:themeShade="FF"/>
+          <w:sz w:val="24"/>
+          <w:szCs w:val="24"/>
+        </w:rPr>
+        <w:t xml:space="preserve">consiga </w:t>
+      </w:r>
+      <w:r>
+        <w:rPr>
+          <w:color w:val="000000" w:themeColor="text1" w:themeTint="FF" w:themeShade="FF"/>
+          <w:sz w:val="24"/>
+          <w:szCs w:val="24"/>
+        </w:rPr>
+        <w:t>ter uma experiência positiva em poder navegar nas páginas com segurança, realizar a aquisição de produtos e serviços</w:t>
+      </w:r>
+      <w:r>
+        <w:rPr>
+          <w:color w:val="000000" w:themeColor="text1" w:themeTint="FF" w:themeShade="FF"/>
+          <w:sz w:val="24"/>
+          <w:szCs w:val="24"/>
+        </w:rPr>
+        <w:t xml:space="preserve"> e conhecer sobre a empresa.</w:t>
+      </w:r>
+    </w:p>
+    <w:p>
+      <w:pPr>
+        <w:widowControl w:val="0"/>
+        <w:pBdr>
           <w:top w:val="nil"/>
           <w:left w:val="nil"/>
           <w:bottom w:val="nil"/>
@@ -2892,167 +3081,22 @@
           <w:between w:val="nil"/>
         </w:pBdr>
         <w:rPr>
+          <w:b/>
+          <w:bCs/>
           <w:color w:val="000000" w:themeColor="text1"/>
           <w:sz w:val="24"/>
           <w:szCs w:val="24"/>
         </w:rPr>
       </w:pPr>
-      <w:r>
-        <w:rPr>
-          <w:color w:val="000000" w:themeColor="text1"/>
-          <w:sz w:val="24"/>
-          <w:szCs w:val="24"/>
-        </w:rPr>
-        <w:t>O objetivo do</w:t>
-      </w:r>
-      <w:r>
-        <w:rPr>
-          <w:color w:val="000000" w:themeColor="text1"/>
-          <w:sz w:val="24"/>
-          <w:szCs w:val="24"/>
-        </w:rPr>
-        <w:t xml:space="preserve"> website </w:t>
-      </w:r>
-      <w:r>
-        <w:rPr>
-          <w:color w:val="000000" w:themeColor="text1"/>
-          <w:sz w:val="24"/>
-          <w:szCs w:val="24"/>
-        </w:rPr>
-        <w:t xml:space="preserve">é </w:t>
-      </w:r>
-      <w:r>
-        <w:rPr>
-          <w:color w:val="000000" w:themeColor="text1"/>
-          <w:sz w:val="24"/>
-          <w:szCs w:val="24"/>
-        </w:rPr>
-        <w:t>divulgar os</w:t>
-      </w:r>
-      <w:r>
-        <w:rPr>
-          <w:color w:val="000000" w:themeColor="text1"/>
-          <w:sz w:val="24"/>
-          <w:szCs w:val="24"/>
-        </w:rPr>
-        <w:t xml:space="preserve"> serviço</w:t>
-      </w:r>
-      <w:r>
-        <w:rPr>
-          <w:color w:val="000000" w:themeColor="text1"/>
-          <w:sz w:val="24"/>
-          <w:szCs w:val="24"/>
-        </w:rPr>
-        <w:t>s</w:t>
-      </w:r>
-      <w:r>
-        <w:rPr>
-          <w:color w:val="000000" w:themeColor="text1"/>
-          <w:sz w:val="24"/>
-          <w:szCs w:val="24"/>
-        </w:rPr>
-        <w:t>,</w:t>
-      </w:r>
-      <w:r>
-        <w:rPr>
-          <w:color w:val="000000" w:themeColor="text1"/>
-          <w:sz w:val="24"/>
-          <w:szCs w:val="24"/>
-        </w:rPr>
-        <w:t xml:space="preserve"> produtos </w:t>
-      </w:r>
-      <w:r>
-        <w:rPr>
-          <w:color w:val="000000" w:themeColor="text1"/>
-          <w:sz w:val="24"/>
-          <w:szCs w:val="24"/>
-        </w:rPr>
-        <w:t>e</w:t>
-      </w:r>
-      <w:r>
-        <w:rPr>
-          <w:color w:val="000000" w:themeColor="text1"/>
-          <w:sz w:val="24"/>
-          <w:szCs w:val="24"/>
-        </w:rPr>
-        <w:t xml:space="preserve"> atendimento</w:t>
-      </w:r>
-      <w:r>
-        <w:rPr>
-          <w:color w:val="000000" w:themeColor="text1"/>
-          <w:sz w:val="24"/>
-          <w:szCs w:val="24"/>
-        </w:rPr>
-        <w:t>s</w:t>
-      </w:r>
-      <w:r>
-        <w:rPr>
-          <w:color w:val="000000" w:themeColor="text1"/>
-          <w:sz w:val="24"/>
-          <w:szCs w:val="24"/>
-        </w:rPr>
-        <w:t xml:space="preserve"> d</w:t>
-      </w:r>
-      <w:r>
-        <w:rPr>
-          <w:color w:val="000000" w:themeColor="text1"/>
-          <w:sz w:val="24"/>
-          <w:szCs w:val="24"/>
-        </w:rPr>
-        <w:t>a empresa Patinhas Felizes</w:t>
-      </w:r>
-      <w:r>
-        <w:rPr>
-          <w:color w:val="000000" w:themeColor="text1"/>
-          <w:sz w:val="24"/>
-          <w:szCs w:val="24"/>
-        </w:rPr>
-        <w:t>, para que o</w:t>
-      </w:r>
-      <w:r>
-        <w:rPr>
-          <w:color w:val="000000" w:themeColor="text1"/>
-          <w:sz w:val="24"/>
-          <w:szCs w:val="24"/>
-        </w:rPr>
-        <w:t xml:space="preserve"> </w:t>
-      </w:r>
-      <w:r>
-        <w:rPr>
-          <w:color w:val="000000" w:themeColor="text1"/>
-          <w:sz w:val="24"/>
-          <w:szCs w:val="24"/>
-        </w:rPr>
-        <w:t xml:space="preserve">cliente </w:t>
-      </w:r>
-      <w:r>
-        <w:rPr>
-          <w:color w:val="000000" w:themeColor="text1"/>
-          <w:sz w:val="24"/>
-          <w:szCs w:val="24"/>
-        </w:rPr>
-        <w:t xml:space="preserve">consiga </w:t>
-      </w:r>
-      <w:r>
-        <w:rPr>
-          <w:color w:val="000000" w:themeColor="text1"/>
-          <w:sz w:val="24"/>
-          <w:szCs w:val="24"/>
-        </w:rPr>
-        <w:t>ter uma experiência positiva em poder navegar nas páginas com segurança, realizar a aquisição de produtos e serviços</w:t>
-      </w:r>
-      <w:r>
-        <w:rPr>
-          <w:color w:val="000000" w:themeColor="text1"/>
-          <w:sz w:val="24"/>
-          <w:szCs w:val="24"/>
-        </w:rPr>
-        <w:t xml:space="preserve"> e conhecer sobre a empresa.</w:t>
-      </w:r>
-    </w:p>
-    <w:p>
-      <w:pPr>
-        <w:widowControl w:val="0"/>
+    </w:p>
+    <w:p>
+      <w:pPr>
+        <w:pStyle w:val="ListParagraph"/>
+        <w:widowControl w:val="0"/>
+        <w:numPr>
+          <w:ilvl w:val="1"/>
+          <w:numId w:val="1"/>
+        </w:numPr>
         <w:pBdr>
           <w:top w:val="nil"/>
           <w:left w:val="nil"/>
@@ -3062,21 +3106,167 @@
         </w:pBdr>
         <w:rPr>
           <w:b/>
-          <w:bCs/>
-          <w:color w:val="000000" w:themeColor="text1"/>
-          <w:sz w:val="24"/>
-          <w:szCs w:val="24"/>
-        </w:rPr>
-      </w:pPr>
+          <w:color w:val="000000"/>
+          <w:sz w:val="24"/>
+          <w:szCs w:val="24"/>
+        </w:rPr>
+      </w:pPr>
+      <w:r>
+        <w:rPr>
+          <w:b w:val="1"/>
+          <w:bCs w:val="1"/>
+          <w:color w:val="000000" w:themeColor="text1" w:themeTint="FF" w:themeShade="FF"/>
+          <w:sz w:val="24"/>
+          <w:szCs w:val="24"/>
+        </w:rPr>
+        <w:t>Objetivos E</w:t>
+      </w:r>
+      <w:r>
+        <w:rPr>
+          <w:b w:val="1"/>
+          <w:bCs w:val="1"/>
+          <w:color w:val="000000" w:themeColor="text1" w:themeTint="FF" w:themeShade="FF"/>
+          <w:sz w:val="24"/>
+          <w:szCs w:val="24"/>
+        </w:rPr>
+        <w:t>specíficos</w:t>
+      </w:r>
     </w:p>
     <w:p>
       <w:pPr>
         <w:pStyle w:val="ListParagraph"/>
         <w:widowControl w:val="0"/>
         <w:numPr>
-          <w:ilvl w:val="1"/>
-          <w:numId w:val="1"/>
+          <w:ilvl w:val="0"/>
+          <w:numId w:val="4"/>
         </w:numPr>
+        <w:pBdr>
+          <w:top w:val="nil" w:color="000000" w:sz="0" w:space="0"/>
+          <w:left w:val="nil" w:color="000000" w:sz="0" w:space="0"/>
+          <w:bottom w:val="nil" w:color="000000" w:sz="0" w:space="0"/>
+          <w:right w:val="nil" w:color="000000" w:sz="0" w:space="0"/>
+          <w:between w:val="nil" w:color="000000" w:sz="0" w:space="0"/>
+        </w:pBdr>
+        <w:spacing w:line="360" w:lineRule="auto"/>
+        <w:ind w:left="720" w:firstLine="283"/>
+        <w:jc w:val="both"/>
+        <w:rPr>
+          <w:color w:val="000000" w:themeColor="text1" w:themeTint="FF" w:themeShade="FF"/>
+          <w:sz w:val="24"/>
+          <w:szCs w:val="24"/>
+        </w:rPr>
+      </w:pPr>
+      <w:r>
+        <w:rPr>
+          <w:color w:val="000000" w:themeColor="text1" w:themeTint="FF" w:themeShade="FF"/>
+          <w:sz w:val="24"/>
+          <w:szCs w:val="24"/>
+        </w:rPr>
+        <w:t xml:space="preserve">Venda online de produtos para pets, </w:t>
+      </w:r>
+      <w:r>
+        <w:rPr>
+          <w:color w:val="000000" w:themeColor="text1" w:themeTint="FF" w:themeShade="FF"/>
+          <w:sz w:val="24"/>
+          <w:szCs w:val="24"/>
+        </w:rPr>
+        <w:t>a fim</w:t>
+      </w:r>
+      <w:r>
+        <w:rPr>
+          <w:color w:val="000000" w:themeColor="text1" w:themeTint="FF" w:themeShade="FF"/>
+          <w:sz w:val="24"/>
+          <w:szCs w:val="24"/>
+        </w:rPr>
+        <w:t xml:space="preserve"> de facilitar a compra desses produtos;</w:t>
+      </w:r>
+    </w:p>
+    <w:p>
+      <w:pPr>
+        <w:pStyle w:val="ListParagraph"/>
+        <w:widowControl w:val="0"/>
+        <w:numPr>
+          <w:ilvl w:val="0"/>
+          <w:numId w:val="4"/>
+        </w:numPr>
+        <w:pBdr>
+          <w:top w:val="nil" w:color="000000" w:sz="0" w:space="0"/>
+          <w:left w:val="nil" w:color="000000" w:sz="0" w:space="0"/>
+          <w:bottom w:val="nil" w:color="000000" w:sz="0" w:space="0"/>
+          <w:right w:val="nil" w:color="000000" w:sz="0" w:space="0"/>
+          <w:between w:val="nil" w:color="000000" w:sz="0" w:space="0"/>
+        </w:pBdr>
+        <w:spacing w:line="360" w:lineRule="auto"/>
+        <w:ind w:left="720" w:firstLine="283"/>
+        <w:jc w:val="both"/>
+        <w:rPr>
+          <w:color w:val="000000" w:themeColor="text1" w:themeTint="FF" w:themeShade="FF"/>
+          <w:sz w:val="24"/>
+          <w:szCs w:val="24"/>
+        </w:rPr>
+      </w:pPr>
+      <w:r>
+        <w:rPr>
+          <w:color w:val="000000" w:themeColor="text1" w:themeTint="FF" w:themeShade="FF"/>
+          <w:sz w:val="24"/>
+          <w:szCs w:val="24"/>
+        </w:rPr>
+        <w:t xml:space="preserve">Apartir do nosso </w:t>
+      </w:r>
+      <w:r>
+        <w:rPr>
+          <w:color w:val="000000" w:themeColor="text1" w:themeTint="FF" w:themeShade="FF"/>
+          <w:sz w:val="24"/>
+          <w:szCs w:val="24"/>
+        </w:rPr>
+        <w:t>chatbot</w:t>
+      </w:r>
+      <w:r>
+        <w:rPr>
+          <w:color w:val="000000" w:themeColor="text1" w:themeTint="FF" w:themeShade="FF"/>
+          <w:sz w:val="24"/>
+          <w:szCs w:val="24"/>
+        </w:rPr>
+        <w:t xml:space="preserve"> será possível tirar dúvidas sobre a saúde e o bem-estar do seu animalzinho;</w:t>
+      </w:r>
+    </w:p>
+    <w:p>
+      <w:pPr>
+        <w:pStyle w:val="ListParagraph"/>
+        <w:widowControl w:val="0"/>
+        <w:numPr>
+          <w:ilvl w:val="0"/>
+          <w:numId w:val="4"/>
+        </w:numPr>
+        <w:pBdr>
+          <w:top w:val="nil" w:color="000000" w:sz="0" w:space="0"/>
+          <w:left w:val="nil" w:color="000000" w:sz="0" w:space="0"/>
+          <w:bottom w:val="nil" w:color="000000" w:sz="0" w:space="0"/>
+          <w:right w:val="nil" w:color="000000" w:sz="0" w:space="0"/>
+          <w:between w:val="nil" w:color="000000" w:sz="0" w:space="0"/>
+        </w:pBdr>
+        <w:spacing w:line="360" w:lineRule="auto"/>
+        <w:ind w:left="720" w:firstLine="283"/>
+        <w:jc w:val="both"/>
+        <w:rPr>
+          <w:color w:val="000000" w:themeColor="text1" w:themeTint="FF" w:themeShade="FF"/>
+          <w:sz w:val="24"/>
+          <w:szCs w:val="24"/>
+        </w:rPr>
+      </w:pPr>
+      <w:r>
+        <w:rPr>
+          <w:color w:val="000000" w:themeColor="text1" w:themeTint="FF" w:themeShade="FF"/>
+          <w:sz w:val="24"/>
+          <w:szCs w:val="24"/>
+        </w:rPr>
+        <w:t>Criação de uma página no nosso site com contatos de veterinários confiáveis para melhor suporte e ajuda.</w:t>
+      </w:r>
+    </w:p>
+    <w:p>
+      <w:pPr>
+        <w:pStyle w:val="ListParagraph"/>
+        <w:widowControl w:val="0"/>
         <w:pBdr>
           <w:top w:val="nil"/>
           <w:left w:val="nil"/>
@@ -3086,20 +3276,67 @@
         </w:pBdr>
         <w:rPr>
           <w:b/>
+          <w:bCs/>
+          <w:color w:val="000000" w:themeColor="text1"/>
+          <w:sz w:val="24"/>
+          <w:szCs w:val="24"/>
+        </w:rPr>
+      </w:pPr>
+    </w:p>
+    <w:p>
+      <w:pPr>
+        <w:pStyle w:val="ListParagraph"/>
+        <w:widowControl w:val="0"/>
+        <w:numPr>
+          <w:ilvl w:val="0"/>
+          <w:numId w:val="1"/>
+        </w:numPr>
+        <w:pBdr>
+          <w:top w:val="nil"/>
+          <w:left w:val="nil"/>
+          <w:bottom w:val="nil"/>
+          <w:right w:val="nil"/>
+          <w:between w:val="nil"/>
+        </w:pBdr>
+        <w:rPr>
+          <w:b/>
           <w:color w:val="000000"/>
           <w:sz w:val="24"/>
           <w:szCs w:val="24"/>
         </w:rPr>
+      </w:pPr>
+      <w:r>
+        <w:rPr>
+          <w:b/>
+          <w:color w:val="000000" w:themeColor="text1"/>
+          <w:sz w:val="24"/>
+          <w:szCs w:val="24"/>
+        </w:rPr>
+        <w:t>Requisitos</w:t>
+      </w:r>
+    </w:p>
+    <w:p>
+      <w:pPr>
+        <w:pStyle w:val="Normal"/>
+        <w:widowControl w:val="0"/>
+        <w:pBdr>
+          <w:top w:val="nil" w:color="FF000000" w:sz="0" w:space="0"/>
+          <w:left w:val="nil" w:color="FF000000" w:sz="0" w:space="0"/>
+          <w:bottom w:val="nil" w:color="FF000000" w:sz="0" w:space="0"/>
+          <w:right w:val="nil" w:color="FF000000" w:sz="0" w:space="0"/>
+          <w:between w:val="nil" w:color="FF000000" w:sz="0" w:space="0"/>
+        </w:pBdr>
+        <w:ind w:left="360"/>
       </w:pPr>
       <w:r>
         <w:rPr>
           <w:b w:val="1"/>
           <w:bCs w:val="1"/>
-          <w:color w:val="000000" w:themeColor="text1" w:themeTint="FF" w:themeShade="FF"/>
-          <w:sz w:val="24"/>
-          <w:szCs w:val="24"/>
-        </w:rPr>
-        <w:t>Objetivos E</w:t>
+          <w:color w:val="000000" w:themeColor="text1"/>
+          <w:sz w:val="24"/>
+          <w:szCs w:val="24"/>
+        </w:rPr>
+        <w:t>4</w:t>
       </w:r>
       <w:r>
         <w:rPr>
@@ -3109,17 +3346,23 @@
           <w:sz w:val="24"/>
           <w:szCs w:val="24"/>
         </w:rPr>
-        <w:t>specíficos</w:t>
-      </w:r>
-    </w:p>
-    <w:p>
-      <w:pPr>
-        <w:pStyle w:val="ListParagraph"/>
-        <w:widowControl w:val="0"/>
-        <w:numPr>
-          <w:ilvl w:val="0"/>
-          <w:numId w:val="4"/>
-        </w:numPr>
+        <w:t>.1. Requisitos</w:t>
+      </w:r>
+      <w:r>
+        <w:rPr>
+          <w:b w:val="1"/>
+          <w:bCs w:val="1"/>
+          <w:color w:val="000000" w:themeColor="text1" w:themeTint="FF" w:themeShade="FF"/>
+          <w:sz w:val="24"/>
+          <w:szCs w:val="24"/>
+        </w:rPr>
+        <w:t xml:space="preserve"> funcionais </w:t>
+      </w:r>
+    </w:p>
+    <w:p>
+      <w:pPr>
+        <w:pStyle w:val="Normal"/>
+        <w:widowControl w:val="0"/>
         <w:pBdr>
           <w:top w:val="nil" w:color="000000" w:sz="0" w:space="0"/>
           <w:left w:val="nil" w:color="000000" w:sz="0" w:space="0"/>
@@ -3127,230 +3370,16 @@
           <w:right w:val="nil" w:color="000000" w:sz="0" w:space="0"/>
           <w:between w:val="nil" w:color="000000" w:sz="0" w:space="0"/>
         </w:pBdr>
-        <w:rPr>
-          <w:color w:val="000000" w:themeColor="text1" w:themeTint="FF" w:themeShade="FF"/>
-          <w:sz w:val="24"/>
-          <w:szCs w:val="24"/>
-        </w:rPr>
-      </w:pPr>
-      <w:r>
-        <w:rPr>
-          <w:color w:val="000000" w:themeColor="text1" w:themeTint="FF" w:themeShade="FF"/>
-          <w:sz w:val="24"/>
-          <w:szCs w:val="24"/>
-        </w:rPr>
-        <w:t xml:space="preserve">Venda online de produtos para pets, </w:t>
-      </w:r>
-      <w:r>
-        <w:rPr>
-          <w:color w:val="000000" w:themeColor="text1" w:themeTint="FF" w:themeShade="FF"/>
-          <w:sz w:val="24"/>
-          <w:szCs w:val="24"/>
-        </w:rPr>
-        <w:t>a fim</w:t>
-      </w:r>
-      <w:r>
-        <w:rPr>
-          <w:color w:val="000000" w:themeColor="text1" w:themeTint="FF" w:themeShade="FF"/>
-          <w:sz w:val="24"/>
-          <w:szCs w:val="24"/>
-        </w:rPr>
-        <w:t xml:space="preserve"> de facilitar a compra desses produtos;</w:t>
-      </w:r>
-    </w:p>
-    <w:p>
-      <w:pPr>
-        <w:pStyle w:val="ListParagraph"/>
-        <w:widowControl w:val="0"/>
-        <w:numPr>
-          <w:ilvl w:val="0"/>
-          <w:numId w:val="4"/>
-        </w:numPr>
-        <w:pBdr>
-          <w:top w:val="nil" w:color="000000" w:sz="0" w:space="0"/>
-          <w:left w:val="nil" w:color="000000" w:sz="0" w:space="0"/>
-          <w:bottom w:val="nil" w:color="000000" w:sz="0" w:space="0"/>
-          <w:right w:val="nil" w:color="000000" w:sz="0" w:space="0"/>
-          <w:between w:val="nil" w:color="000000" w:sz="0" w:space="0"/>
-        </w:pBdr>
-        <w:rPr>
-          <w:color w:val="000000" w:themeColor="text1" w:themeTint="FF" w:themeShade="FF"/>
-          <w:sz w:val="24"/>
-          <w:szCs w:val="24"/>
-        </w:rPr>
-      </w:pPr>
-      <w:r>
-        <w:rPr>
-          <w:color w:val="000000" w:themeColor="text1" w:themeTint="FF" w:themeShade="FF"/>
-          <w:sz w:val="24"/>
-          <w:szCs w:val="24"/>
-        </w:rPr>
-        <w:t xml:space="preserve">Apartir do nosso </w:t>
-      </w:r>
-      <w:r>
-        <w:rPr>
-          <w:color w:val="000000" w:themeColor="text1" w:themeTint="FF" w:themeShade="FF"/>
-          <w:sz w:val="24"/>
-          <w:szCs w:val="24"/>
-        </w:rPr>
-        <w:t>chatbot</w:t>
-      </w:r>
-      <w:r>
-        <w:rPr>
-          <w:color w:val="000000" w:themeColor="text1" w:themeTint="FF" w:themeShade="FF"/>
-          <w:sz w:val="24"/>
-          <w:szCs w:val="24"/>
-        </w:rPr>
-        <w:t xml:space="preserve"> será possível tirar dúvidas sobre a saúde e o bem-estar do seu animalzinho;</w:t>
-      </w:r>
-    </w:p>
-    <w:p>
-      <w:pPr>
-        <w:pStyle w:val="ListParagraph"/>
-        <w:widowControl w:val="0"/>
-        <w:numPr>
-          <w:ilvl w:val="0"/>
-          <w:numId w:val="4"/>
-        </w:numPr>
-        <w:pBdr>
-          <w:top w:val="nil" w:color="000000" w:sz="0" w:space="0"/>
-          <w:left w:val="nil" w:color="000000" w:sz="0" w:space="0"/>
-          <w:bottom w:val="nil" w:color="000000" w:sz="0" w:space="0"/>
-          <w:right w:val="nil" w:color="000000" w:sz="0" w:space="0"/>
-          <w:between w:val="nil" w:color="000000" w:sz="0" w:space="0"/>
-        </w:pBdr>
-        <w:rPr>
-          <w:color w:val="000000" w:themeColor="text1" w:themeTint="FF" w:themeShade="FF"/>
-          <w:sz w:val="24"/>
-          <w:szCs w:val="24"/>
-        </w:rPr>
-      </w:pPr>
-      <w:r>
-        <w:rPr>
-          <w:color w:val="000000" w:themeColor="text1" w:themeTint="FF" w:themeShade="FF"/>
-          <w:sz w:val="24"/>
-          <w:szCs w:val="24"/>
-        </w:rPr>
-        <w:t>Criação de uma página no nosso site com contatos de veterinários confiáveis para melhor suporte e ajuda.</w:t>
-      </w:r>
-    </w:p>
-    <w:p>
-      <w:pPr>
-        <w:pStyle w:val="ListParagraph"/>
-        <w:widowControl w:val="0"/>
-        <w:pBdr>
-          <w:top w:val="nil"/>
-          <w:left w:val="nil"/>
-          <w:bottom w:val="nil"/>
-          <w:right w:val="nil"/>
-          <w:between w:val="nil"/>
-        </w:pBdr>
-        <w:rPr>
-          <w:b/>
-          <w:bCs/>
-          <w:color w:val="000000" w:themeColor="text1"/>
-          <w:sz w:val="24"/>
-          <w:szCs w:val="24"/>
-        </w:rPr>
-      </w:pPr>
-    </w:p>
-    <w:p>
-      <w:pPr>
-        <w:pStyle w:val="ListParagraph"/>
-        <w:widowControl w:val="0"/>
-        <w:numPr>
-          <w:ilvl w:val="0"/>
-          <w:numId w:val="1"/>
-        </w:numPr>
-        <w:pBdr>
-          <w:top w:val="nil"/>
-          <w:left w:val="nil"/>
-          <w:bottom w:val="nil"/>
-          <w:right w:val="nil"/>
-          <w:between w:val="nil"/>
-        </w:pBdr>
-        <w:rPr>
-          <w:b/>
-          <w:color w:val="000000"/>
-          <w:sz w:val="24"/>
-          <w:szCs w:val="24"/>
-        </w:rPr>
-      </w:pPr>
-      <w:r>
-        <w:rPr>
-          <w:b/>
-          <w:color w:val="000000" w:themeColor="text1"/>
-          <w:sz w:val="24"/>
-          <w:szCs w:val="24"/>
-        </w:rPr>
-        <w:t>Requisitos</w:t>
-      </w:r>
-    </w:p>
-    <w:p>
-      <w:pPr>
-        <w:pStyle w:val="Normal"/>
-        <w:widowControl w:val="0"/>
-        <w:pBdr>
-          <w:top w:val="nil" w:color="FF000000" w:sz="0" w:space="0"/>
-          <w:left w:val="nil" w:color="FF000000" w:sz="0" w:space="0"/>
-          <w:bottom w:val="nil" w:color="FF000000" w:sz="0" w:space="0"/>
-          <w:right w:val="nil" w:color="FF000000" w:sz="0" w:space="0"/>
-          <w:between w:val="nil" w:color="FF000000" w:sz="0" w:space="0"/>
-        </w:pBdr>
         <w:ind w:left="360"/>
-      </w:pPr>
-      <w:r>
-        <w:rPr>
-          <w:b w:val="1"/>
-          <w:bCs w:val="1"/>
-          <w:color w:val="000000" w:themeColor="text1"/>
-          <w:sz w:val="24"/>
-          <w:szCs w:val="24"/>
-        </w:rPr>
-        <w:t>4</w:t>
-      </w:r>
-      <w:r>
-        <w:rPr>
-          <w:b w:val="1"/>
-          <w:bCs w:val="1"/>
-          <w:color w:val="000000" w:themeColor="text1" w:themeTint="FF" w:themeShade="FF"/>
-          <w:sz w:val="24"/>
-          <w:szCs w:val="24"/>
-        </w:rPr>
-        <w:t>.1. Requisitos</w:t>
-      </w:r>
-      <w:r>
-        <w:rPr>
-          <w:b w:val="1"/>
-          <w:bCs w:val="1"/>
-          <w:color w:val="000000" w:themeColor="text1" w:themeTint="FF" w:themeShade="FF"/>
-          <w:sz w:val="24"/>
-          <w:szCs w:val="24"/>
-        </w:rPr>
-        <w:t xml:space="preserve"> funcionais </w:t>
-      </w:r>
-    </w:p>
-    <w:p>
-      <w:pPr>
-        <w:pStyle w:val="Normal"/>
-        <w:widowControl w:val="0"/>
-        <w:pBdr>
-          <w:top w:val="nil" w:color="FF000000" w:sz="0" w:space="0"/>
-          <w:left w:val="nil" w:color="FF000000" w:sz="0" w:space="0"/>
-          <w:bottom w:val="nil" w:color="FF000000" w:sz="0" w:space="0"/>
-          <w:right w:val="nil" w:color="FF000000" w:sz="0" w:space="0"/>
-          <w:between w:val="nil" w:color="FF000000" w:sz="0" w:space="0"/>
-        </w:pBdr>
-        <w:ind w:left="360"/>
-        <w:rPr>
-          <w:color w:val="000000" w:themeColor="text1"/>
+        <w:rPr>
+          <w:color w:val="000000" w:themeColor="text1" w:themeTint="FF" w:themeShade="FF"/>
           <w:sz w:val="16"/>
           <w:szCs w:val="16"/>
         </w:rPr>
       </w:pPr>
       <w:r>
         <w:drawing>
-          <wp:inline wp14:editId="58C2369B" wp14:anchorId="6A533AA4">
+          <wp:inline wp14:editId="3A60D156" wp14:anchorId="6A533AA4">
             <wp:extent cx="6029325" cy="922707"/>
             <wp:effectExtent l="0" t="0" r="0" b="0"/>
             <wp:docPr id="1108366562" name="Imagem 10"/>
@@ -3402,6 +3431,7 @@
     </w:p>
     <w:p>
       <w:pPr>
+        <w:pStyle w:val="Normal"/>
         <w:widowControl w:val="0"/>
         <w:pBdr>
           <w:top w:val="nil" w:color="FF000000" w:sz="0" w:space="0"/>
@@ -3411,204 +3441,9 @@
           <w:between w:val="nil" w:color="FF000000" w:sz="0" w:space="0"/>
         </w:pBdr>
         <w:rPr>
-          <w:color w:val="000000" w:themeColor="text1"/>
+          <w:color w:val="000000" w:themeColor="text1" w:themeTint="FF" w:themeShade="FF"/>
           <w:sz w:val="18"/>
           <w:szCs w:val="18"/>
-        </w:rPr>
-      </w:pPr>
-    </w:p>
-    <w:p>
-      <w:pPr>
-        <w:widowControl w:val="0"/>
-        <w:pBdr>
-          <w:top w:val="nil" w:color="FF000000" w:sz="0" w:space="0"/>
-          <w:left w:val="nil" w:color="FF000000" w:sz="0" w:space="0"/>
-          <w:bottom w:val="nil" w:color="FF000000" w:sz="0" w:space="0"/>
-          <w:right w:val="nil" w:color="FF000000" w:sz="0" w:space="0"/>
-          <w:between w:val="nil" w:color="FF000000" w:sz="0" w:space="0"/>
-        </w:pBdr>
-        <w:rPr>
-          <w:color w:val="000000" w:themeColor="text1" w:themeTint="FF" w:themeShade="FF"/>
-          <w:sz w:val="18"/>
-          <w:szCs w:val="18"/>
-        </w:rPr>
-      </w:pPr>
-    </w:p>
-    <w:p>
-      <w:pPr>
-        <w:widowControl w:val="0"/>
-        <w:pBdr>
-          <w:top w:val="nil" w:color="FF000000" w:sz="0" w:space="0"/>
-          <w:left w:val="nil" w:color="FF000000" w:sz="0" w:space="0"/>
-          <w:bottom w:val="nil" w:color="FF000000" w:sz="0" w:space="0"/>
-          <w:right w:val="nil" w:color="FF000000" w:sz="0" w:space="0"/>
-          <w:between w:val="nil" w:color="FF000000" w:sz="0" w:space="0"/>
-        </w:pBdr>
-        <w:rPr>
-          <w:color w:val="000000" w:themeColor="text1" w:themeTint="FF" w:themeShade="FF"/>
-          <w:sz w:val="18"/>
-          <w:szCs w:val="18"/>
-        </w:rPr>
-      </w:pPr>
-    </w:p>
-    <w:p>
-      <w:pPr>
-        <w:widowControl w:val="0"/>
-        <w:pBdr>
-          <w:top w:val="nil" w:color="FF000000" w:sz="0" w:space="0"/>
-          <w:left w:val="nil" w:color="FF000000" w:sz="0" w:space="0"/>
-          <w:bottom w:val="nil" w:color="FF000000" w:sz="0" w:space="0"/>
-          <w:right w:val="nil" w:color="FF000000" w:sz="0" w:space="0"/>
-          <w:between w:val="nil" w:color="FF000000" w:sz="0" w:space="0"/>
-        </w:pBdr>
-        <w:rPr>
-          <w:color w:val="000000" w:themeColor="text1" w:themeTint="FF" w:themeShade="FF"/>
-          <w:sz w:val="18"/>
-          <w:szCs w:val="18"/>
-        </w:rPr>
-      </w:pPr>
-    </w:p>
-    <w:p>
-      <w:pPr>
-        <w:widowControl w:val="0"/>
-        <w:pBdr>
-          <w:top w:val="nil" w:color="FF000000" w:sz="0" w:space="0"/>
-          <w:left w:val="nil" w:color="FF000000" w:sz="0" w:space="0"/>
-          <w:bottom w:val="nil" w:color="FF000000" w:sz="0" w:space="0"/>
-          <w:right w:val="nil" w:color="FF000000" w:sz="0" w:space="0"/>
-          <w:between w:val="nil" w:color="FF000000" w:sz="0" w:space="0"/>
-        </w:pBdr>
-        <w:rPr>
-          <w:color w:val="000000" w:themeColor="text1" w:themeTint="FF" w:themeShade="FF"/>
-          <w:sz w:val="18"/>
-          <w:szCs w:val="18"/>
-        </w:rPr>
-      </w:pPr>
-    </w:p>
-    <w:p>
-      <w:pPr>
-        <w:widowControl w:val="0"/>
-        <w:pBdr>
-          <w:top w:val="nil" w:color="FF000000" w:sz="0" w:space="0"/>
-          <w:left w:val="nil" w:color="FF000000" w:sz="0" w:space="0"/>
-          <w:bottom w:val="nil" w:color="FF000000" w:sz="0" w:space="0"/>
-          <w:right w:val="nil" w:color="FF000000" w:sz="0" w:space="0"/>
-          <w:between w:val="nil" w:color="FF000000" w:sz="0" w:space="0"/>
-        </w:pBdr>
-        <w:rPr>
-          <w:color w:val="000000" w:themeColor="text1" w:themeTint="FF" w:themeShade="FF"/>
-          <w:sz w:val="18"/>
-          <w:szCs w:val="18"/>
-        </w:rPr>
-      </w:pPr>
-    </w:p>
-    <w:p>
-      <w:pPr>
-        <w:widowControl w:val="0"/>
-        <w:pBdr>
-          <w:top w:val="nil" w:color="FF000000" w:sz="0" w:space="0"/>
-          <w:left w:val="nil" w:color="FF000000" w:sz="0" w:space="0"/>
-          <w:bottom w:val="nil" w:color="FF000000" w:sz="0" w:space="0"/>
-          <w:right w:val="nil" w:color="FF000000" w:sz="0" w:space="0"/>
-          <w:between w:val="nil" w:color="FF000000" w:sz="0" w:space="0"/>
-        </w:pBdr>
-        <w:rPr>
-          <w:color w:val="000000" w:themeColor="text1" w:themeTint="FF" w:themeShade="FF"/>
-          <w:sz w:val="18"/>
-          <w:szCs w:val="18"/>
-        </w:rPr>
-      </w:pPr>
-    </w:p>
-    <w:p>
-      <w:pPr>
-        <w:widowControl w:val="0"/>
-        <w:pBdr>
-          <w:top w:val="nil" w:color="FF000000" w:sz="0" w:space="0"/>
-          <w:left w:val="nil" w:color="FF000000" w:sz="0" w:space="0"/>
-          <w:bottom w:val="nil" w:color="FF000000" w:sz="0" w:space="0"/>
-          <w:right w:val="nil" w:color="FF000000" w:sz="0" w:space="0"/>
-          <w:between w:val="nil" w:color="FF000000" w:sz="0" w:space="0"/>
-        </w:pBdr>
-        <w:rPr>
-          <w:color w:val="000000" w:themeColor="text1" w:themeTint="FF" w:themeShade="FF"/>
-          <w:sz w:val="18"/>
-          <w:szCs w:val="18"/>
-        </w:rPr>
-      </w:pPr>
-    </w:p>
-    <w:p>
-      <w:pPr>
-        <w:widowControl w:val="0"/>
-        <w:pBdr>
-          <w:top w:val="nil" w:color="FF000000" w:sz="0" w:space="0"/>
-          <w:left w:val="nil" w:color="FF000000" w:sz="0" w:space="0"/>
-          <w:bottom w:val="nil" w:color="FF000000" w:sz="0" w:space="0"/>
-          <w:right w:val="nil" w:color="FF000000" w:sz="0" w:space="0"/>
-          <w:between w:val="nil" w:color="FF000000" w:sz="0" w:space="0"/>
-        </w:pBdr>
-        <w:rPr>
-          <w:color w:val="000000" w:themeColor="text1" w:themeTint="FF" w:themeShade="FF"/>
-          <w:sz w:val="18"/>
-          <w:szCs w:val="18"/>
-        </w:rPr>
-      </w:pPr>
-    </w:p>
-    <w:p>
-      <w:pPr>
-        <w:widowControl w:val="0"/>
-        <w:pBdr>
-          <w:top w:val="nil" w:color="FF000000" w:sz="0" w:space="0"/>
-          <w:left w:val="nil" w:color="FF000000" w:sz="0" w:space="0"/>
-          <w:bottom w:val="nil" w:color="FF000000" w:sz="0" w:space="0"/>
-          <w:right w:val="nil" w:color="FF000000" w:sz="0" w:space="0"/>
-          <w:between w:val="nil" w:color="FF000000" w:sz="0" w:space="0"/>
-        </w:pBdr>
-        <w:rPr>
-          <w:color w:val="000000" w:themeColor="text1" w:themeTint="FF" w:themeShade="FF"/>
-          <w:sz w:val="18"/>
-          <w:szCs w:val="18"/>
-        </w:rPr>
-      </w:pPr>
-    </w:p>
-    <w:p>
-      <w:pPr>
-        <w:widowControl w:val="0"/>
-        <w:pBdr>
-          <w:top w:val="nil" w:color="FF000000" w:sz="0" w:space="0"/>
-          <w:left w:val="nil" w:color="FF000000" w:sz="0" w:space="0"/>
-          <w:bottom w:val="nil" w:color="FF000000" w:sz="0" w:space="0"/>
-          <w:right w:val="nil" w:color="FF000000" w:sz="0" w:space="0"/>
-          <w:between w:val="nil" w:color="FF000000" w:sz="0" w:space="0"/>
-        </w:pBdr>
-        <w:rPr>
-          <w:color w:val="000000" w:themeColor="text1" w:themeTint="FF" w:themeShade="FF"/>
-          <w:sz w:val="18"/>
-          <w:szCs w:val="18"/>
-        </w:rPr>
-      </w:pPr>
-    </w:p>
-    <w:p>
-      <w:pPr>
-        <w:widowControl w:val="0"/>
-        <w:pBdr>
-          <w:top w:val="nil" w:color="FF000000" w:sz="0" w:space="0"/>
-          <w:left w:val="nil" w:color="FF000000" w:sz="0" w:space="0"/>
-          <w:bottom w:val="nil" w:color="FF000000" w:sz="0" w:space="0"/>
-          <w:right w:val="nil" w:color="FF000000" w:sz="0" w:space="0"/>
-          <w:between w:val="nil" w:color="FF000000" w:sz="0" w:space="0"/>
-        </w:pBdr>
-        <w:rPr>
-          <w:color w:val="000000" w:themeColor="text1" w:themeTint="FF" w:themeShade="FF"/>
-          <w:sz w:val="18"/>
-          <w:szCs w:val="18"/>
-        </w:rPr>
-      </w:pPr>
-    </w:p>
-    <w:p>
-      <w:pPr>
-        <w:rPr>
-          <w:sz w:val="24"/>
-          <w:szCs w:val="24"/>
         </w:rPr>
       </w:pPr>
     </w:p>
@@ -3708,7 +3543,7 @@
             </w:pPr>
             <w:r>
               <w:drawing>
-                <wp:inline wp14:editId="469359F2" wp14:anchorId="5BDFA8B8">
+                <wp:inline wp14:editId="69C946D4" wp14:anchorId="5BDFA8B8">
                   <wp:extent cx="1257300" cy="935355"/>
                   <wp:effectExtent l="0" t="0" r="0" b="0"/>
                   <wp:docPr id="38071148" name="image5.png"/>
@@ -3905,7 +3740,7 @@
       </w:pPr>
       <w:r>
         <w:drawing>
-          <wp:inline wp14:editId="7E962AF0" wp14:anchorId="5447F5B5">
+          <wp:inline wp14:editId="786CEAB1" wp14:anchorId="5447F5B5">
             <wp:extent cx="6029325" cy="1685925"/>
             <wp:effectExtent l="0" t="0" r="0" b="0"/>
             <wp:docPr id="418855603" name="drawing"/>
@@ -4538,7 +4373,7 @@
             </w:pPr>
             <w:r>
               <w:drawing>
-                <wp:inline wp14:editId="27A64A94" wp14:anchorId="27C1536C">
+                <wp:inline wp14:editId="68B84CF0" wp14:anchorId="27C1536C">
                   <wp:extent cx="1257300" cy="935355"/>
                   <wp:effectExtent l="0" t="0" r="0" b="0"/>
                   <wp:docPr id="703445090" name="image5.png"/>
@@ -4796,7 +4631,7 @@
       </w:pPr>
       <w:r>
         <w:drawing>
-          <wp:inline wp14:editId="23DE33B8" wp14:anchorId="1B39DEFF">
+          <wp:inline wp14:editId="3DDF1064" wp14:anchorId="1B39DEFF">
             <wp:extent cx="5648325" cy="2831828"/>
             <wp:effectExtent l="0" t="0" r="0" b="0"/>
             <wp:docPr id="1470118995" name="drawing"/>

</xml_diff>